<commit_message>
Updating with the actual weight values from the decision tree model's feature importances. This will provide more insight into which features are most influential in the model's predictions.
</commit_message>
<xml_diff>
--- a/SEER_Lung_Cancer_Analysis.docx
+++ b/SEER_Lung_Cancer_Analysis.docx
@@ -7397,7 +7397,7 @@
                 <w:sz w:val="19"/>
                 <w:szCs w:val="19"/>
               </w:rPr>
-              <w:t xml:space="preserve">2.2953</w:t>
+              <w:t xml:space="preserve">2.3301</w:t>
             </w:r>
           </w:p>
         </w:tc>
@@ -7483,7 +7483,7 @@
                 <w:sz w:val="19"/>
                 <w:szCs w:val="19"/>
               </w:rPr>
-              <w:t xml:space="preserve">1.7391</w:t>
+              <w:t xml:space="preserve">1.7538</w:t>
             </w:r>
           </w:p>
         </w:tc>
@@ -7569,7 +7569,7 @@
                 <w:sz w:val="19"/>
                 <w:szCs w:val="19"/>
               </w:rPr>
-              <w:t xml:space="preserve">0.8835</w:t>
+              <w:t xml:space="preserve">0.8846</w:t>
             </w:r>
           </w:p>
         </w:tc>
@@ -7655,7 +7655,7 @@
                 <w:sz w:val="19"/>
                 <w:szCs w:val="19"/>
               </w:rPr>
-              <w:t xml:space="preserve">0.5410</w:t>
+              <w:t xml:space="preserve">0.5219</w:t>
             </w:r>
           </w:p>
         </w:tc>
@@ -7741,7 +7741,7 @@
                 <w:sz w:val="19"/>
                 <w:szCs w:val="19"/>
               </w:rPr>
-              <w:t xml:space="preserve">0.4417</w:t>
+              <w:t xml:space="preserve">0.3706</w:t>
             </w:r>
           </w:p>
         </w:tc>
@@ -7827,7 +7827,7 @@
                 <w:sz w:val="19"/>
                 <w:szCs w:val="19"/>
               </w:rPr>
-              <w:t xml:space="preserve">0.3825</w:t>
+              <w:t xml:space="preserve">0.3392</w:t>
             </w:r>
           </w:p>
         </w:tc>
@@ -7913,7 +7913,7 @@
                 <w:sz w:val="19"/>
                 <w:szCs w:val="19"/>
               </w:rPr>
-              <w:t xml:space="preserve">0.3561</w:t>
+              <w:t xml:space="preserve">0.2852</w:t>
             </w:r>
           </w:p>
         </w:tc>
@@ -7999,7 +7999,7 @@
                 <w:sz w:val="19"/>
                 <w:szCs w:val="19"/>
               </w:rPr>
-              <w:t xml:space="preserve">0.3422</w:t>
+              <w:t xml:space="preserve">0.2747</w:t>
             </w:r>
           </w:p>
         </w:tc>
@@ -8085,7 +8085,7 @@
                 <w:sz w:val="19"/>
                 <w:szCs w:val="19"/>
               </w:rPr>
-              <w:t xml:space="preserve">0.1711</w:t>
+              <w:t xml:space="preserve">0.1584</w:t>
             </w:r>
           </w:p>
         </w:tc>
@@ -8171,7 +8171,7 @@
                 <w:sz w:val="19"/>
                 <w:szCs w:val="19"/>
               </w:rPr>
-              <w:t xml:space="preserve">0.1397</w:t>
+              <w:t xml:space="preserve">0.0764</w:t>
             </w:r>
           </w:p>
         </w:tc>
@@ -8211,7 +8211,7 @@
           <w:sz w:val="17"/>
           <w:szCs w:val="17"/>
         </w:rPr>
-        <w:t xml:space="preserve">Epoch [50/500]   Train Loss: ~1.06  Test Loss: ~1.49  LR: 0.001000</w:t>
+        <w:t xml:space="preserve">Epoch [50/500]   Train Loss: ~0.62  Test Loss: ~0.96  LR: 0.001000</w:t>
       </w:r>
     </w:p>
     <w:p>
@@ -8226,7 +8226,7 @@
           <w:sz w:val="17"/>
           <w:szCs w:val="17"/>
         </w:rPr>
-        <w:t xml:space="preserve">Epoch [100/500]  Train Loss: ~0.55  Test Loss: ~1.04  LR: 0.001000</w:t>
+        <w:t xml:space="preserve">Epoch [100/500]  Train Loss: ~0.52  Test Loss: ~0.87  LR: 0.001000</w:t>
       </w:r>
     </w:p>
     <w:p>
@@ -8256,7 +8256,7 @@
           <w:sz w:val="17"/>
           <w:szCs w:val="17"/>
         </w:rPr>
-        <w:t xml:space="preserve">Epoch [500/500]  Train Loss: ~0.43  Test Loss: ~1.38  LR: 0.001000</w:t>
+        <w:t xml:space="preserve">Epoch [500/500]  Train Loss: ~0.43  Test Loss: ~0.95  LR: 0.001000</w:t>
       </w:r>
     </w:p>
     <w:p>
@@ -8286,7 +8286,7 @@
           <w:sz w:val="17"/>
           <w:szCs w:val="17"/>
         </w:rPr>
-        <w:t xml:space="preserve">Unique log-scale predictions: 807  ✓ Predictions vary as expected</w:t>
+        <w:t xml:space="preserve">Unique log-scale predictions: 742  ✓ Predictions vary as expected</w:t>
       </w:r>
     </w:p>
     <w:p>
@@ -15222,7 +15222,7 @@
                 <w:sz w:val="19"/>
                 <w:szCs w:val="19"/>
               </w:rPr>
-              <w:t xml:space="preserve">R² = −0.343 (needs improvement)</w:t>
+              <w:t xml:space="preserve">R² = −0.286 (needs improvement)</w:t>
             </w:r>
           </w:p>
         </w:tc>
@@ -15336,7 +15336,7 @@
                 <w:sz w:val="19"/>
                 <w:szCs w:val="19"/>
               </w:rPr>
-              <w:t xml:space="preserve">22.74 months (near-constant predictions)</w:t>
+              <w:t xml:space="preserve">21.59 months (compressed range: 1.96–6.07 months predicted)</w:t>
             </w:r>
           </w:p>
         </w:tc>
@@ -16127,7 +16127,7 @@
           <w:sz w:val="20"/>
           <w:szCs w:val="20"/>
         </w:rPr>
-        <w:t xml:space="preserve">Neural Network: currently underperforming (near-constant predictions, R² &lt; 0). Importance weighting is collapsing gradients. Recommend removing Step 12b weighting and retraining without input scaling as next diagnostic step.</w:t>
+        <w:t xml:space="preserve">Neural Network: predictions now vary (range 1.96–6.07 months) but R² remains negative (−0.286). The model is learning something but the predicted range is too narrow relative to actual survival (0–275 months). Recommend removing Step 12b importance weighting entirely and retraining without input scaling as the next diagnostic step.</w:t>
       </w:r>
     </w:p>
     <w:p>

</xml_diff>